<commit_message>
Did the last finishing touches
</commit_message>
<xml_diff>
--- a/homeworks/homework01/homework 1_answer sheet_finecon.docx
+++ b/homeworks/homework01/homework 1_answer sheet_finecon.docx
@@ -341,6 +341,50 @@
               <w:t>Mean monthly log return NIKKEI: 0.0053</w:t>
             </w:r>
           </w:p>
+          <w:p>
+            <w:pPr>
+              <w:rPr>
+                <w:rFonts w:ascii="Arial" w:hAnsi="Arial" w:cs="Arial"/>
+                <w:sz w:val="20"/>
+                <w:szCs w:val="20"/>
+              </w:rPr>
+            </w:pPr>
+          </w:p>
+          <w:p>
+            <w:pPr>
+              <w:rPr>
+                <w:rFonts w:ascii="Arial" w:hAnsi="Arial" w:cs="Arial"/>
+                <w:sz w:val="20"/>
+                <w:szCs w:val="20"/>
+              </w:rPr>
+            </w:pPr>
+          </w:p>
+          <w:p>
+            <w:pPr>
+              <w:rPr>
+                <w:rFonts w:ascii="Arial" w:hAnsi="Arial" w:cs="Arial"/>
+                <w:sz w:val="20"/>
+                <w:szCs w:val="20"/>
+              </w:rPr>
+            </w:pPr>
+          </w:p>
+          <w:p>
+            <w:pPr>
+              <w:rPr>
+                <w:rFonts w:ascii="Arial" w:hAnsi="Arial" w:cs="Arial"/>
+                <w:sz w:val="20"/>
+                <w:szCs w:val="20"/>
+              </w:rPr>
+            </w:pPr>
+            <w:r>
+              <w:rPr>
+                <w:rFonts w:ascii="Arial" w:hAnsi="Arial" w:cs="Arial"/>
+                <w:sz w:val="20"/>
+                <w:szCs w:val="20"/>
+              </w:rPr>
+              <w:t>Note: Subsampled starting January 2011 as instructed in the PDF.</w:t>
+            </w:r>
+          </w:p>
         </w:tc>
         <w:tc>
           <w:tcPr>
@@ -379,7 +423,6 @@
                 <w:sz w:val="20"/>
                 <w:szCs w:val="20"/>
               </w:rPr>
-              <w:lastRenderedPageBreak/>
               <w:t xml:space="preserve">3) In separate graphs, plot the time series of the WTI price index and of WTI returns. Comment briefly on any striking feature of the return series. </w:t>
             </w:r>
             <w:r>
@@ -421,27 +464,29 @@
                 <w:sz w:val="20"/>
                 <w:szCs w:val="20"/>
               </w:rPr>
-              <w:t xml:space="preserve">WTI returns show a spike of ~ -80% around March 2020, </w:t>
-            </w:r>
-            <w:r>
-              <w:rPr>
-                <w:rFonts w:ascii="Arial" w:hAnsi="Arial" w:cs="Arial"/>
-                <w:sz w:val="20"/>
-                <w:szCs w:val="20"/>
-              </w:rPr>
-              <w:t>highlighting</w:t>
-            </w:r>
-            <w:r>
-              <w:rPr>
-                <w:rFonts w:ascii="Arial" w:hAnsi="Arial" w:cs="Arial"/>
-                <w:sz w:val="20"/>
-                <w:szCs w:val="20"/>
-              </w:rPr>
-              <w:t xml:space="preserve"> their volatility.</w:t>
-            </w:r>
-            <w:r>
-              <w:rPr>
-                <w:rFonts w:ascii="Arial" w:hAnsi="Arial" w:cs="Arial"/>
+              <w:t>WTI returns show a spike of -78.19% around Mar 2020, highlighting the volatility.</w:t>
+            </w:r>
+            <w:r>
+              <w:rPr>
+                <w:rFonts w:ascii="Arial" w:hAnsi="Arial" w:cs="Arial"/>
+                <w:sz w:val="20"/>
+                <w:szCs w:val="20"/>
+              </w:rPr>
+              <w:t xml:space="preserve"> The year 2020 was the year of the pandemic, where the oil prices </w:t>
+            </w:r>
+            <w:r>
+              <w:rPr>
+                <w:rFonts w:ascii="Arial" w:hAnsi="Arial" w:cs="Arial"/>
+                <w:sz w:val="20"/>
+                <w:szCs w:val="20"/>
+              </w:rPr>
+              <w:lastRenderedPageBreak/>
+              <w:t>crashed.</w:t>
+            </w:r>
+            <w:r>
+              <w:rPr>
+                <w:rFonts w:ascii="Arial" w:hAnsi="Arial" w:cs="Arial"/>
+                <w:noProof/>
                 <w:sz w:val="20"/>
                 <w:szCs w:val="20"/>
               </w:rPr>
@@ -556,47 +601,53 @@
                 <w:rFonts w:ascii="Arial" w:hAnsi="Arial" w:cs="Arial"/>
                 <w:sz w:val="20"/>
                 <w:szCs w:val="20"/>
-              </w:rPr>
-            </w:pPr>
-            <w:r>
-              <w:rPr>
-                <w:rFonts w:ascii="Arial" w:hAnsi="Arial" w:cs="Arial"/>
-                <w:sz w:val="20"/>
-                <w:szCs w:val="20"/>
-              </w:rPr>
-              <w:t>t-statistic: 0.9383</w:t>
-            </w:r>
-          </w:p>
-          <w:p>
-            <w:pPr>
-              <w:rPr>
-                <w:rFonts w:ascii="Arial" w:hAnsi="Arial" w:cs="Arial"/>
-                <w:sz w:val="20"/>
-                <w:szCs w:val="20"/>
-              </w:rPr>
-            </w:pPr>
-            <w:r>
-              <w:rPr>
-                <w:rFonts w:ascii="Arial" w:hAnsi="Arial" w:cs="Arial"/>
-                <w:sz w:val="20"/>
-                <w:szCs w:val="20"/>
-              </w:rPr>
-              <w:t>p-value: 0.3494</w:t>
-            </w:r>
-          </w:p>
-          <w:p>
-            <w:pPr>
-              <w:rPr>
-                <w:rFonts w:ascii="Arial" w:hAnsi="Arial" w:cs="Arial"/>
-                <w:sz w:val="20"/>
-                <w:szCs w:val="20"/>
-              </w:rPr>
-            </w:pPr>
-            <w:r>
-              <w:rPr>
-                <w:rFonts w:ascii="Arial" w:hAnsi="Arial" w:cs="Arial"/>
-                <w:sz w:val="20"/>
-                <w:szCs w:val="20"/>
+                <w:lang/>
+              </w:rPr>
+            </w:pPr>
+            <w:r>
+              <w:rPr>
+                <w:rFonts w:ascii="Arial" w:hAnsi="Arial" w:cs="Arial"/>
+                <w:sz w:val="20"/>
+                <w:szCs w:val="20"/>
+                <w:lang/>
+              </w:rPr>
+              <w:t>t-statistic: 0.9994</w:t>
+            </w:r>
+          </w:p>
+          <w:p>
+            <w:pPr>
+              <w:rPr>
+                <w:rFonts w:ascii="Arial" w:hAnsi="Arial" w:cs="Arial"/>
+                <w:sz w:val="20"/>
+                <w:szCs w:val="20"/>
+                <w:lang/>
+              </w:rPr>
+            </w:pPr>
+            <w:r>
+              <w:rPr>
+                <w:rFonts w:ascii="Arial" w:hAnsi="Arial" w:cs="Arial"/>
+                <w:sz w:val="20"/>
+                <w:szCs w:val="20"/>
+                <w:lang/>
+              </w:rPr>
+              <w:t>p-value: 0.3190</w:t>
+            </w:r>
+          </w:p>
+          <w:p>
+            <w:pPr>
+              <w:rPr>
+                <w:rFonts w:ascii="Arial" w:hAnsi="Arial" w:cs="Arial"/>
+                <w:sz w:val="20"/>
+                <w:szCs w:val="20"/>
+                <w:lang w:val="de-CH"/>
+              </w:rPr>
+            </w:pPr>
+            <w:r>
+              <w:rPr>
+                <w:rFonts w:ascii="Arial" w:hAnsi="Arial" w:cs="Arial"/>
+                <w:sz w:val="20"/>
+                <w:szCs w:val="20"/>
+                <w:lang/>
               </w:rPr>
               <w:t>FAILED TO REJECT H_0</w:t>
             </w:r>
@@ -607,6 +658,7 @@
                 <w:rFonts w:ascii="Arial" w:hAnsi="Arial" w:cs="Arial"/>
                 <w:sz w:val="20"/>
                 <w:szCs w:val="20"/>
+                <w:lang w:val="de-CH"/>
               </w:rPr>
             </w:pPr>
           </w:p>
@@ -846,47 +898,53 @@
                 <w:rFonts w:ascii="Arial" w:hAnsi="Arial" w:cs="Arial"/>
                 <w:sz w:val="20"/>
                 <w:szCs w:val="20"/>
-              </w:rPr>
-            </w:pPr>
-            <w:r>
-              <w:rPr>
-                <w:rFonts w:ascii="Arial" w:hAnsi="Arial" w:cs="Arial"/>
-                <w:sz w:val="20"/>
-                <w:szCs w:val="20"/>
-              </w:rPr>
-              <w:t>95% CI lower bound: -0.0000</w:t>
-            </w:r>
-          </w:p>
-          <w:p>
-            <w:pPr>
-              <w:rPr>
-                <w:rFonts w:ascii="Arial" w:hAnsi="Arial" w:cs="Arial"/>
-                <w:sz w:val="20"/>
-                <w:szCs w:val="20"/>
-              </w:rPr>
-            </w:pPr>
-            <w:r>
-              <w:rPr>
-                <w:rFonts w:ascii="Arial" w:hAnsi="Arial" w:cs="Arial"/>
-                <w:sz w:val="20"/>
-                <w:szCs w:val="20"/>
-              </w:rPr>
-              <w:t>95% CI upper bound: 0.0131</w:t>
-            </w:r>
-          </w:p>
-          <w:p>
-            <w:pPr>
-              <w:rPr>
-                <w:rFonts w:ascii="Arial" w:hAnsi="Arial" w:cs="Arial"/>
-                <w:sz w:val="20"/>
-                <w:szCs w:val="20"/>
-              </w:rPr>
-            </w:pPr>
-            <w:r>
-              <w:rPr>
-                <w:rFonts w:ascii="Arial" w:hAnsi="Arial" w:cs="Arial"/>
-                <w:sz w:val="20"/>
-                <w:szCs w:val="20"/>
+                <w:lang/>
+              </w:rPr>
+            </w:pPr>
+            <w:r>
+              <w:rPr>
+                <w:rFonts w:ascii="Arial" w:hAnsi="Arial" w:cs="Arial"/>
+                <w:sz w:val="20"/>
+                <w:szCs w:val="20"/>
+                <w:lang/>
+              </w:rPr>
+              <w:t>95% CI lower bound: -0.0004</w:t>
+            </w:r>
+          </w:p>
+          <w:p>
+            <w:pPr>
+              <w:rPr>
+                <w:rFonts w:ascii="Arial" w:hAnsi="Arial" w:cs="Arial"/>
+                <w:sz w:val="20"/>
+                <w:szCs w:val="20"/>
+                <w:lang/>
+              </w:rPr>
+            </w:pPr>
+            <w:r>
+              <w:rPr>
+                <w:rFonts w:ascii="Arial" w:hAnsi="Arial" w:cs="Arial"/>
+                <w:sz w:val="20"/>
+                <w:szCs w:val="20"/>
+                <w:lang/>
+              </w:rPr>
+              <w:t>95% CI upper bound: 0.0128</w:t>
+            </w:r>
+          </w:p>
+          <w:p>
+            <w:pPr>
+              <w:rPr>
+                <w:rFonts w:ascii="Arial" w:hAnsi="Arial" w:cs="Arial"/>
+                <w:sz w:val="20"/>
+                <w:szCs w:val="20"/>
+                <w:lang/>
+              </w:rPr>
+            </w:pPr>
+            <w:r>
+              <w:rPr>
+                <w:rFonts w:ascii="Arial" w:hAnsi="Arial" w:cs="Arial"/>
+                <w:sz w:val="20"/>
+                <w:szCs w:val="20"/>
+                <w:lang/>
               </w:rPr>
               <w:t>Average monthly risk-free rate: 0.0021</w:t>
             </w:r>
@@ -904,6 +962,7 @@
                 <w:rFonts w:ascii="Arial" w:hAnsi="Arial" w:cs="Arial"/>
                 <w:sz w:val="20"/>
                 <w:szCs w:val="20"/>
+                <w:lang/>
               </w:rPr>
               <w:t>Cannot claim Gold outperformed the risk-free rate at the 95% confidence level.</w:t>
             </w:r>
@@ -1025,6 +1084,30 @@
               </w:rPr>
               <w:t>WTI most correlated with: STOXX600_monthly_log_return</w:t>
             </w:r>
+            <w:r>
+              <w:rPr>
+                <w:rFonts w:ascii="Arial" w:hAnsi="Arial" w:cs="Arial"/>
+                <w:sz w:val="20"/>
+                <w:szCs w:val="20"/>
+              </w:rPr>
+              <w:t xml:space="preserve"> (r= </w:t>
+            </w:r>
+            <w:r>
+              <w:rPr>
+                <w:rFonts w:ascii="Arial" w:hAnsi="Arial" w:cs="Arial"/>
+                <w:sz w:val="20"/>
+                <w:szCs w:val="20"/>
+              </w:rPr>
+              <w:t>0.44</w:t>
+            </w:r>
+            <w:r>
+              <w:rPr>
+                <w:rFonts w:ascii="Arial" w:hAnsi="Arial" w:cs="Arial"/>
+                <w:sz w:val="20"/>
+                <w:szCs w:val="20"/>
+              </w:rPr>
+              <w:t>)</w:t>
+            </w:r>
           </w:p>
           <w:p>
             <w:pPr>
@@ -1042,49 +1125,95 @@
               </w:rPr>
               <w:t>SP500 most correlated with: STOXX600_monthly_log_return</w:t>
             </w:r>
-          </w:p>
-          <w:p>
-            <w:pPr>
-              <w:rPr>
-                <w:rFonts w:ascii="Arial" w:hAnsi="Arial" w:cs="Arial"/>
-                <w:sz w:val="20"/>
-                <w:szCs w:val="20"/>
-              </w:rPr>
-            </w:pPr>
-          </w:p>
-          <w:p>
-            <w:pPr>
-              <w:rPr>
-                <w:rFonts w:ascii="Arial" w:hAnsi="Arial" w:cs="Arial"/>
-                <w:sz w:val="20"/>
-                <w:szCs w:val="20"/>
-              </w:rPr>
-            </w:pPr>
-            <w:r>
-              <w:rPr>
-                <w:rFonts w:ascii="Arial" w:hAnsi="Arial" w:cs="Arial"/>
-                <w:sz w:val="20"/>
-                <w:szCs w:val="20"/>
-              </w:rPr>
-              <w:t xml:space="preserve">It is </w:t>
-            </w:r>
-            <w:proofErr w:type="gramStart"/>
-            <w:r>
-              <w:rPr>
-                <w:rFonts w:ascii="Arial" w:hAnsi="Arial" w:cs="Arial"/>
-                <w:sz w:val="20"/>
-                <w:szCs w:val="20"/>
-              </w:rPr>
-              <w:t>surprising,</w:t>
-            </w:r>
-            <w:proofErr w:type="gramEnd"/>
-            <w:r>
-              <w:rPr>
-                <w:rFonts w:ascii="Arial" w:hAnsi="Arial" w:cs="Arial"/>
-                <w:sz w:val="20"/>
-                <w:szCs w:val="20"/>
-              </w:rPr>
-              <w:t xml:space="preserve"> that WTI’s strongest correlation is with European equities rather than US ones</w:t>
+            <w:r>
+              <w:rPr>
+                <w:rFonts w:ascii="Arial" w:hAnsi="Arial" w:cs="Arial"/>
+                <w:sz w:val="20"/>
+                <w:szCs w:val="20"/>
+              </w:rPr>
+              <w:t xml:space="preserve"> (r=</w:t>
+            </w:r>
+            <w:r>
+              <w:rPr>
+                <w:rFonts w:ascii="Arial" w:hAnsi="Arial" w:cs="Arial"/>
+                <w:sz w:val="20"/>
+                <w:szCs w:val="20"/>
+              </w:rPr>
+              <w:t>0.8</w:t>
+            </w:r>
+            <w:r>
+              <w:rPr>
+                <w:rFonts w:ascii="Arial" w:hAnsi="Arial" w:cs="Arial"/>
+                <w:sz w:val="20"/>
+                <w:szCs w:val="20"/>
+              </w:rPr>
+              <w:t>2)</w:t>
+            </w:r>
+          </w:p>
+          <w:p>
+            <w:pPr>
+              <w:rPr>
+                <w:rFonts w:ascii="Arial" w:hAnsi="Arial" w:cs="Arial"/>
+                <w:sz w:val="20"/>
+                <w:szCs w:val="20"/>
+              </w:rPr>
+            </w:pPr>
+          </w:p>
+          <w:p>
+            <w:pPr>
+              <w:rPr>
+                <w:rFonts w:ascii="Arial" w:hAnsi="Arial" w:cs="Arial"/>
+                <w:sz w:val="20"/>
+                <w:szCs w:val="20"/>
+              </w:rPr>
+            </w:pPr>
+            <w:r>
+              <w:rPr>
+                <w:rFonts w:ascii="Arial" w:hAnsi="Arial" w:cs="Arial"/>
+                <w:sz w:val="20"/>
+                <w:szCs w:val="20"/>
+              </w:rPr>
+              <w:t>It</w:t>
+            </w:r>
+            <w:r>
+              <w:rPr>
+                <w:rFonts w:ascii="Arial" w:hAnsi="Arial" w:cs="Arial"/>
+                <w:sz w:val="20"/>
+                <w:szCs w:val="20"/>
+              </w:rPr>
+              <w:t>’</w:t>
+            </w:r>
+            <w:r>
+              <w:rPr>
+                <w:rFonts w:ascii="Arial" w:hAnsi="Arial" w:cs="Arial"/>
+                <w:sz w:val="20"/>
+                <w:szCs w:val="20"/>
+              </w:rPr>
+              <w:t>s surprising, that WTI’s strongest correlation is with European equities</w:t>
+            </w:r>
+            <w:r>
+              <w:rPr>
+                <w:rFonts w:ascii="Arial" w:hAnsi="Arial" w:cs="Arial"/>
+                <w:sz w:val="20"/>
+                <w:szCs w:val="20"/>
+              </w:rPr>
+              <w:t xml:space="preserve"> (r=0.44)</w:t>
+            </w:r>
+            <w:r>
+              <w:rPr>
+                <w:rFonts w:ascii="Arial" w:hAnsi="Arial" w:cs="Arial"/>
+                <w:sz w:val="20"/>
+                <w:szCs w:val="20"/>
+              </w:rPr>
+              <w:t xml:space="preserve"> rather than US ones</w:t>
+            </w:r>
+            <w:r>
+              <w:rPr>
+                <w:rFonts w:ascii="Arial" w:hAnsi="Arial" w:cs="Arial"/>
+                <w:sz w:val="20"/>
+                <w:szCs w:val="20"/>
+              </w:rPr>
+              <w:t xml:space="preserve"> (r=0.40)</w:t>
             </w:r>
             <w:r>
               <w:rPr>
@@ -1203,71 +1332,123 @@
                 <w:sz w:val="20"/>
                 <w:szCs w:val="20"/>
               </w:rPr>
-              <w:t xml:space="preserve"> = 15.6302</w:t>
-            </w:r>
-          </w:p>
-          <w:p>
-            <w:pPr>
-              <w:rPr>
-                <w:rFonts w:ascii="Arial" w:hAnsi="Arial" w:cs="Arial"/>
-                <w:sz w:val="20"/>
-                <w:szCs w:val="20"/>
-              </w:rPr>
-            </w:pPr>
-          </w:p>
-          <w:p>
-            <w:pPr>
-              <w:rPr>
-                <w:rFonts w:ascii="Arial" w:hAnsi="Arial" w:cs="Arial"/>
-                <w:sz w:val="20"/>
-                <w:szCs w:val="20"/>
-              </w:rPr>
-            </w:pPr>
-            <w:r>
-              <w:rPr>
-                <w:rFonts w:ascii="Arial" w:hAnsi="Arial" w:cs="Arial"/>
-                <w:sz w:val="20"/>
-                <w:szCs w:val="20"/>
-              </w:rPr>
-              <w:t>No, the distribution is not approximately normal</w:t>
-            </w:r>
-            <w:r>
-              <w:rPr>
-                <w:rFonts w:ascii="Arial" w:hAnsi="Arial" w:cs="Arial"/>
-                <w:sz w:val="20"/>
-                <w:szCs w:val="20"/>
-              </w:rPr>
-              <w:t>. I</w:t>
-            </w:r>
-            <w:r>
-              <w:rPr>
-                <w:rFonts w:ascii="Arial" w:hAnsi="Arial" w:cs="Arial"/>
-                <w:sz w:val="20"/>
-                <w:szCs w:val="20"/>
-              </w:rPr>
-              <w:t>t has heavy tails and a sharp peak (excess kurtosis of 15.63), far from the normal value of 0.</w:t>
-            </w:r>
-          </w:p>
-          <w:p>
-            <w:pPr>
-              <w:rPr>
-                <w:rFonts w:ascii="Arial" w:hAnsi="Arial" w:cs="Arial"/>
-                <w:sz w:val="20"/>
-                <w:szCs w:val="20"/>
-              </w:rPr>
-            </w:pPr>
-          </w:p>
-          <w:p>
-            <w:pPr>
-              <w:rPr>
-                <w:rFonts w:ascii="Arial" w:hAnsi="Arial" w:cs="Arial"/>
-                <w:sz w:val="20"/>
-                <w:szCs w:val="20"/>
-              </w:rPr>
-            </w:pPr>
-            <w:r>
-              <w:rPr>
-                <w:rFonts w:ascii="Arial" w:hAnsi="Arial" w:cs="Arial"/>
+              <w:t xml:space="preserve"> = 15.</w:t>
+            </w:r>
+            <w:r>
+              <w:rPr>
+                <w:rFonts w:ascii="Arial" w:hAnsi="Arial" w:cs="Arial"/>
+                <w:sz w:val="20"/>
+                <w:szCs w:val="20"/>
+              </w:rPr>
+              <w:t>7320</w:t>
+            </w:r>
+          </w:p>
+          <w:p>
+            <w:pPr>
+              <w:rPr>
+                <w:rFonts w:ascii="Arial" w:hAnsi="Arial" w:cs="Arial"/>
+                <w:sz w:val="20"/>
+                <w:szCs w:val="20"/>
+              </w:rPr>
+            </w:pPr>
+          </w:p>
+          <w:p>
+            <w:pPr>
+              <w:rPr>
+                <w:rFonts w:ascii="Arial" w:hAnsi="Arial" w:cs="Arial"/>
+                <w:sz w:val="20"/>
+                <w:szCs w:val="20"/>
+              </w:rPr>
+            </w:pPr>
+            <w:r>
+              <w:rPr>
+                <w:rFonts w:ascii="Arial" w:hAnsi="Arial" w:cs="Arial"/>
+                <w:sz w:val="20"/>
+                <w:szCs w:val="20"/>
+              </w:rPr>
+              <w:t>The distribution is not approximately normal. The histogram has heavier tails and a sharper peak than the normal distribution.</w:t>
+            </w:r>
+          </w:p>
+          <w:p>
+            <w:pPr>
+              <w:rPr>
+                <w:rFonts w:ascii="Arial" w:hAnsi="Arial" w:cs="Arial"/>
+                <w:sz w:val="20"/>
+                <w:szCs w:val="20"/>
+              </w:rPr>
+            </w:pPr>
+          </w:p>
+          <w:p>
+            <w:pPr>
+              <w:rPr>
+                <w:rFonts w:ascii="Arial" w:hAnsi="Arial" w:cs="Arial"/>
+                <w:sz w:val="20"/>
+                <w:szCs w:val="20"/>
+              </w:rPr>
+            </w:pPr>
+            <w:r>
+              <w:rPr>
+                <w:rFonts w:ascii="Arial" w:hAnsi="Arial" w:cs="Arial"/>
+                <w:sz w:val="20"/>
+                <w:szCs w:val="20"/>
+              </w:rPr>
+              <w:t>Statistically, the excess kurtosis is 15.</w:t>
+            </w:r>
+            <w:r>
+              <w:rPr>
+                <w:rFonts w:ascii="Arial" w:hAnsi="Arial" w:cs="Arial"/>
+                <w:sz w:val="20"/>
+                <w:szCs w:val="20"/>
+              </w:rPr>
+              <w:t>73</w:t>
+            </w:r>
+            <w:r>
+              <w:rPr>
+                <w:rFonts w:ascii="Arial" w:hAnsi="Arial" w:cs="Arial"/>
+                <w:sz w:val="20"/>
+                <w:szCs w:val="20"/>
+              </w:rPr>
+              <w:t xml:space="preserve">. The excess kurtosis of a normal distribution should be 0. Our value is very high, probably due to the spike of </w:t>
+            </w:r>
+            <w:r>
+              <w:rPr>
+                <w:rFonts w:ascii="Arial" w:hAnsi="Arial" w:cs="Arial"/>
+                <w:sz w:val="20"/>
+                <w:szCs w:val="20"/>
+              </w:rPr>
+              <w:t>-78.19% around Mar 2020</w:t>
+            </w:r>
+            <w:r>
+              <w:rPr>
+                <w:rFonts w:ascii="Arial" w:hAnsi="Arial" w:cs="Arial"/>
+                <w:sz w:val="20"/>
+                <w:szCs w:val="20"/>
+              </w:rPr>
+              <w:t>.</w:t>
+            </w:r>
+          </w:p>
+          <w:p>
+            <w:pPr>
+              <w:rPr>
+                <w:rFonts w:ascii="Arial" w:hAnsi="Arial" w:cs="Arial"/>
+                <w:sz w:val="20"/>
+                <w:szCs w:val="20"/>
+                <w:lang w:val="de-CH"/>
+              </w:rPr>
+            </w:pPr>
+          </w:p>
+          <w:p>
+            <w:pPr>
+              <w:rPr>
+                <w:rFonts w:ascii="Arial" w:hAnsi="Arial" w:cs="Arial"/>
+                <w:sz w:val="20"/>
+                <w:szCs w:val="20"/>
+              </w:rPr>
+            </w:pPr>
+            <w:r>
+              <w:rPr>
+                <w:rFonts w:ascii="Arial" w:hAnsi="Arial" w:cs="Arial"/>
+                <w:noProof/>
                 <w:sz w:val="20"/>
                 <w:szCs w:val="20"/>
               </w:rPr>
@@ -1408,23 +1589,57 @@
                 <w:sz w:val="20"/>
                 <w:szCs w:val="20"/>
               </w:rPr>
-              <w:t xml:space="preserve">JB statistic: 1739.7922, p-value: </w:t>
-            </w:r>
-            <w:r>
-              <w:rPr>
-                <w:rFonts w:ascii="Arial" w:hAnsi="Arial" w:cs="Arial"/>
-                <w:sz w:val="20"/>
-                <w:szCs w:val="20"/>
-              </w:rPr>
-              <w:t>~</w:t>
-            </w:r>
-            <w:r>
-              <w:rPr>
-                <w:rFonts w:ascii="Arial" w:hAnsi="Arial" w:cs="Arial"/>
-                <w:sz w:val="20"/>
-                <w:szCs w:val="20"/>
-              </w:rPr>
-              <w:t>0.0</w:t>
+              <w:t xml:space="preserve">JB statistic: </w:t>
+            </w:r>
+            <w:r>
+              <w:rPr>
+                <w:rFonts w:ascii="Arial" w:hAnsi="Arial" w:cs="Arial"/>
+                <w:sz w:val="20"/>
+                <w:szCs w:val="20"/>
+              </w:rPr>
+              <w:t>1772.8998</w:t>
+            </w:r>
+            <w:r>
+              <w:rPr>
+                <w:rFonts w:ascii="Arial" w:hAnsi="Arial" w:cs="Arial"/>
+                <w:sz w:val="20"/>
+                <w:szCs w:val="20"/>
+              </w:rPr>
+              <w:t xml:space="preserve">, </w:t>
+            </w:r>
+            <w:r>
+              <w:rPr>
+                <w:rFonts w:ascii="Arial" w:hAnsi="Arial" w:cs="Arial"/>
+                <w:sz w:val="20"/>
+                <w:szCs w:val="20"/>
+              </w:rPr>
+              <w:t>p-value ≈ 0.000</w:t>
+            </w:r>
+          </w:p>
+          <w:p>
+            <w:pPr>
+              <w:rPr>
+                <w:rFonts w:ascii="Arial" w:hAnsi="Arial" w:cs="Arial"/>
+                <w:sz w:val="20"/>
+                <w:szCs w:val="20"/>
+              </w:rPr>
+            </w:pPr>
+          </w:p>
+          <w:p>
+            <w:pPr>
+              <w:rPr>
+                <w:rFonts w:ascii="Arial" w:hAnsi="Arial" w:cs="Arial"/>
+                <w:sz w:val="20"/>
+                <w:szCs w:val="20"/>
+              </w:rPr>
+            </w:pPr>
+            <w:r>
+              <w:rPr>
+                <w:rFonts w:ascii="Arial" w:hAnsi="Arial" w:cs="Arial"/>
+                <w:sz w:val="20"/>
+                <w:szCs w:val="20"/>
+              </w:rPr>
+              <w:t>Because the p-value is approximately 0, we strongly reject the null hypothesis.</w:t>
             </w:r>
           </w:p>
         </w:tc>
@@ -1550,7 +1765,7 @@
                 <w:sz w:val="20"/>
                 <w:szCs w:val="20"/>
               </w:rPr>
-              <w:t>): 81</w:t>
+              <w:t>): 43</w:t>
             </w:r>
           </w:p>
         </w:tc>
@@ -1750,7 +1965,7 @@
                 <w:sz w:val="20"/>
                 <w:szCs w:val="20"/>
               </w:rPr>
-              <w:t>Hiking Cycles -&gt; Mean: 0.0269, IQR: 0.0416</w:t>
+              <w:t>Hiking Cycles -&gt; Mean: 0.0218, IQR: 0.0327</w:t>
             </w:r>
           </w:p>
         </w:tc>
@@ -1843,7 +2058,7 @@
                 <w:sz w:val="20"/>
                 <w:szCs w:val="20"/>
               </w:rPr>
-              <w:t>Easing/Pause Cycles -&gt; Mean: 0.0262, IQR: 0.0552</w:t>
+              <w:t>Easing/Pause Cycles -&gt; Mean: 0.0278, IQR: 0.0542</w:t>
             </w:r>
           </w:p>
         </w:tc>
@@ -2026,60 +2241,113 @@
                 <w:szCs w:val="20"/>
               </w:rPr>
               <w:lastRenderedPageBreak/>
-              <w:t>t-test -&gt; t-statistic: 0.1173, p-value: 0.9067</w:t>
-            </w:r>
-          </w:p>
-          <w:p>
-            <w:pPr>
-              <w:rPr>
-                <w:rFonts w:ascii="Arial" w:hAnsi="Arial" w:cs="Arial"/>
-                <w:sz w:val="20"/>
-                <w:szCs w:val="20"/>
-              </w:rPr>
-            </w:pPr>
-            <w:r>
-              <w:rPr>
-                <w:rFonts w:ascii="Arial" w:hAnsi="Arial" w:cs="Arial"/>
-                <w:sz w:val="20"/>
-                <w:szCs w:val="20"/>
-              </w:rPr>
-              <w:t>Result: Fail to reject H_0. Returns are NOT significantly different at the 5% level.</w:t>
-            </w:r>
-          </w:p>
-          <w:p>
-            <w:pPr>
-              <w:rPr>
-                <w:rFonts w:ascii="Arial" w:hAnsi="Arial" w:cs="Arial"/>
-                <w:sz w:val="20"/>
-                <w:szCs w:val="20"/>
-              </w:rPr>
-            </w:pPr>
-          </w:p>
-          <w:p>
-            <w:pPr>
-              <w:rPr>
-                <w:rFonts w:ascii="Arial" w:hAnsi="Arial" w:cs="Arial"/>
-                <w:sz w:val="20"/>
-                <w:szCs w:val="20"/>
-              </w:rPr>
-            </w:pPr>
-          </w:p>
-          <w:p>
-            <w:pPr>
-              <w:rPr>
-                <w:rFonts w:ascii="Arial" w:hAnsi="Arial" w:cs="Arial"/>
-                <w:sz w:val="20"/>
-                <w:szCs w:val="20"/>
-              </w:rPr>
-            </w:pPr>
-            <w:r>
-              <w:rPr>
-                <w:rFonts w:ascii="Arial" w:hAnsi="Arial" w:cs="Arial"/>
-                <w:sz w:val="20"/>
-                <w:szCs w:val="20"/>
-              </w:rPr>
-              <w:t>The difference is negligible and not significant. One might expect lower returns during hiking cycles due to tightening financial conditions, but the data does not support a meaningful difference.</w:t>
-            </w:r>
+              <w:t>t-test -&gt; t-statistic: -0.7986, p-value: 0.4254</w:t>
+            </w:r>
+          </w:p>
+          <w:p>
+            <w:pPr>
+              <w:rPr>
+                <w:rFonts w:ascii="Arial" w:hAnsi="Arial" w:cs="Arial"/>
+                <w:sz w:val="20"/>
+                <w:szCs w:val="20"/>
+              </w:rPr>
+            </w:pPr>
+          </w:p>
+          <w:p>
+            <w:pPr>
+              <w:rPr>
+                <w:rFonts w:ascii="Arial" w:hAnsi="Arial" w:cs="Arial"/>
+                <w:sz w:val="20"/>
+                <w:szCs w:val="20"/>
+              </w:rPr>
+            </w:pPr>
+            <w:r>
+              <w:rPr>
+                <w:rFonts w:ascii="Arial" w:hAnsi="Arial" w:cs="Arial"/>
+                <w:sz w:val="20"/>
+                <w:szCs w:val="20"/>
+              </w:rPr>
+              <w:t>Result: Fail to reject H_0</w:t>
+            </w:r>
+            <w:r>
+              <w:rPr>
+                <w:rFonts w:ascii="Arial" w:hAnsi="Arial" w:cs="Arial"/>
+                <w:sz w:val="20"/>
+                <w:szCs w:val="20"/>
+              </w:rPr>
+              <w:t xml:space="preserve"> at the 5% level. There is no statistically significant difference in average total returns between hiking and </w:t>
+            </w:r>
+            <w:proofErr w:type="spellStart"/>
+            <w:r>
+              <w:rPr>
+                <w:rFonts w:ascii="Arial" w:hAnsi="Arial" w:cs="Arial"/>
+                <w:sz w:val="20"/>
+                <w:szCs w:val="20"/>
+              </w:rPr>
+              <w:t>easying</w:t>
+            </w:r>
+            <w:proofErr w:type="spellEnd"/>
+            <w:r>
+              <w:rPr>
+                <w:rFonts w:ascii="Arial" w:hAnsi="Arial" w:cs="Arial"/>
+                <w:sz w:val="20"/>
+                <w:szCs w:val="20"/>
+              </w:rPr>
+              <w:t xml:space="preserve"> months.</w:t>
+            </w:r>
+          </w:p>
+          <w:p>
+            <w:pPr>
+              <w:rPr>
+                <w:rFonts w:ascii="Arial" w:hAnsi="Arial" w:cs="Arial"/>
+                <w:sz w:val="20"/>
+                <w:szCs w:val="20"/>
+              </w:rPr>
+            </w:pPr>
+          </w:p>
+          <w:p>
+            <w:pPr>
+              <w:rPr>
+                <w:rFonts w:ascii="Arial" w:hAnsi="Arial" w:cs="Arial"/>
+                <w:sz w:val="20"/>
+                <w:szCs w:val="20"/>
+              </w:rPr>
+            </w:pPr>
+            <w:r>
+              <w:rPr>
+                <w:rFonts w:ascii="Arial" w:hAnsi="Arial" w:cs="Arial"/>
+                <w:sz w:val="20"/>
+                <w:szCs w:val="20"/>
+              </w:rPr>
+              <w:t xml:space="preserve">We expected </w:t>
+            </w:r>
+            <w:proofErr w:type="spellStart"/>
+            <w:r>
+              <w:rPr>
+                <w:rFonts w:ascii="Arial" w:hAnsi="Arial" w:cs="Arial"/>
+                <w:sz w:val="20"/>
+                <w:szCs w:val="20"/>
+              </w:rPr>
+              <w:t>lowr</w:t>
+            </w:r>
+            <w:proofErr w:type="spellEnd"/>
+            <w:r>
+              <w:rPr>
+                <w:rFonts w:ascii="Arial" w:hAnsi="Arial" w:cs="Arial"/>
+                <w:sz w:val="20"/>
+                <w:szCs w:val="20"/>
+              </w:rPr>
+              <w:t xml:space="preserve"> returns during hiking cycles due to tightening financial conditions. The sign of the difference is consistent with this. Hiking returns (0.0218) are lower than easing returns (0.0278), yielding a negative t-statistic. However, the difference is not statistically significant, so we cannot draw a firm conclusion.</w:t>
+            </w:r>
+          </w:p>
+          <w:p>
+            <w:pPr>
+              <w:rPr>
+                <w:rFonts w:ascii="Arial" w:hAnsi="Arial" w:cs="Arial"/>
+                <w:sz w:val="20"/>
+                <w:szCs w:val="20"/>
+              </w:rPr>
+            </w:pPr>
           </w:p>
         </w:tc>
         <w:tc>

</xml_diff>